<commit_message>
Add gitrepo details in doc file
</commit_message>
<xml_diff>
--- a/Python_and_Bash_AnkurSingh/Python_and_Bash_AnkurSingh.docx
+++ b/Python_and_Bash_AnkurSingh/Python_and_Bash_AnkurSingh.docx
@@ -378,6 +378,7 @@
       <w:r>
         <w:rPr>
           <w:rFonts w:ascii="Arial" w:hAnsi="Arial" w:cs="Arial"/>
+          <w:noProof/>
           <w:color w:val="000000"/>
         </w:rPr>
         <w:drawing>
@@ -588,6 +589,7 @@
       <w:r>
         <w:rPr>
           <w:rFonts w:ascii="Arial" w:hAnsi="Arial" w:cs="Arial"/>
+          <w:noProof/>
           <w:color w:val="000000"/>
         </w:rPr>
         <w:drawing>
@@ -640,6 +642,7 @@
       <w:r>
         <w:rPr>
           <w:rFonts w:ascii="Arial" w:hAnsi="Arial" w:cs="Arial"/>
+          <w:noProof/>
           <w:color w:val="000000"/>
         </w:rPr>
         <w:lastRenderedPageBreak/>
@@ -693,6 +696,7 @@
       <w:r>
         <w:rPr>
           <w:rFonts w:ascii="Arial" w:hAnsi="Arial" w:cs="Arial"/>
+          <w:noProof/>
           <w:color w:val="000000"/>
         </w:rPr>
         <w:drawing>
@@ -814,6 +818,7 @@
       <w:r>
         <w:rPr>
           <w:rFonts w:ascii="Arial" w:hAnsi="Arial" w:cs="Arial"/>
+          <w:noProof/>
           <w:color w:val="000000"/>
         </w:rPr>
         <w:drawing>
@@ -866,6 +871,7 @@
       <w:r>
         <w:rPr>
           <w:rFonts w:ascii="Arial" w:hAnsi="Arial" w:cs="Arial"/>
+          <w:noProof/>
           <w:color w:val="000000"/>
         </w:rPr>
         <w:lastRenderedPageBreak/>
@@ -978,6 +984,10 @@
     </w:p>
     <w:p>
       <w:r>
+        <w:rPr>
+          <w:noProof/>
+          <w:lang w:eastAsia="en-IN"/>
+        </w:rPr>
         <w:lastRenderedPageBreak/>
         <w:drawing>
           <wp:inline distT="0" distB="0" distL="0" distR="0" wp14:anchorId="3DB4CD23" wp14:editId="5ADC766F">
@@ -1015,6 +1025,39 @@
           </wp:inline>
         </w:drawing>
       </w:r>
+    </w:p>
+    <w:p/>
+    <w:p>
+      <w:proofErr w:type="spellStart"/>
+      <w:r>
+        <w:t>GitHUb</w:t>
+      </w:r>
+      <w:proofErr w:type="spellEnd"/>
+      <w:r>
+        <w:t xml:space="preserve"> Repo : </w:t>
+      </w:r>
+      <w:hyperlink r:id="rId11" w:history="1">
+        <w:r>
+          <w:rPr>
+            <w:rStyle w:val="Hyperlink"/>
+          </w:rPr>
+          <w:t>Ankur037/</w:t>
+        </w:r>
+        <w:proofErr w:type="spellStart"/>
+        <w:r>
+          <w:rPr>
+            <w:rStyle w:val="Hyperlink"/>
+          </w:rPr>
+          <w:t>TuteDude</w:t>
+        </w:r>
+        <w:proofErr w:type="spellEnd"/>
+        <w:r>
+          <w:rPr>
+            <w:rStyle w:val="Hyperlink"/>
+          </w:rPr>
+          <w:t>: Learn DevOps From Zero</w:t>
+        </w:r>
+      </w:hyperlink>
       <w:bookmarkStart w:id="0" w:name="_GoBack"/>
       <w:bookmarkEnd w:id="0"/>
     </w:p>
@@ -1986,6 +2029,18 @@
       <w:lang w:eastAsia="en-IN"/>
     </w:rPr>
   </w:style>
+  <w:style w:type="character" w:styleId="Hyperlink">
+    <w:name w:val="Hyperlink"/>
+    <w:basedOn w:val="DefaultParagraphFont"/>
+    <w:uiPriority w:val="99"/>
+    <w:semiHidden/>
+    <w:unhideWhenUsed/>
+    <w:rsid w:val="00140054"/>
+    <w:rPr>
+      <w:color w:val="0000FF"/>
+      <w:u w:val="single"/>
+    </w:rPr>
+  </w:style>
 </w:styles>
 </file>
 

</xml_diff>